<commit_message>
feat(review): add built-in comment margins
Replace the merged proof-of-concept DOCX review UI with accepted-final review projections and an opt-in ScrollViewer comment margin. Add neutral default cards, card-content replacement hooks, virtualized lifecycle cleanup, and corresponding PPTX comment support without adding editing behavior.\n\nKeep the default rendering path unchanged when comments are disabled, and retain lower-level anchor APIs for fully application-owned layouts.\n\nVerified with focused DOCX/PPTX ScrollViewer tests, site documentation tests, TypeScript builds, Rust PPTX comment tests, public API baselines, and the DOCX architecture audit gates.\n\nCo-Authored-By: Codex GPT-5 <noreply@openai.com>
</commit_message>
<xml_diff>
--- a/packages/docx/public/demo/sample-1.docx
+++ b/packages/docx/public/demo/sample-1.docx
@@ -567,13 +567,49 @@
           </wp:anchor>
         </w:drawing>
       </w:r>
+      <w:commentRangeStart w:id="3"/>
       <w:r>
         <w:rPr>
           <w:rFonts w:ascii="Georgia" w:hAnsi="Georgia"/>
           <w:color w:val="1A1A1A"/>
           <w:sz w:val="22"/>
         </w:rPr>
-        <w:t>There is a moment, when the trail narrows and the last note of road-noise dies away, in which the forest seems to draw a long breath and look down at you. The light shifts. The temperature drops a degree or two. You become, very suddenly, a small thing among older things — and that smallness is the beginning of attention.</w:t>
+        <w:t xml:space="preserve">There is a moment, when the trail narrows and the last note of </w:t>
+      </w:r>
+      <w:del w:id="102" w:author="Noah Williams" w:date="2026-08-22T09:30:00Z">
+        <w:r>
+          <w:rPr>
+            <w:rFonts w:ascii="Georgia" w:hAnsi="Georgia"/>
+            <w:color w:val="1A1A1A"/>
+            <w:sz w:val="22"/>
+          </w:rPr>
+          <w:delText>road-noise</w:delText>
+        </w:r>
+      </w:del>
+      <w:ins w:id="103" w:author="Noah Williams" w:date="2026-08-22T09:30:00Z">
+        <w:r>
+          <w:rPr>
+            <w:rFonts w:ascii="Georgia" w:hAnsi="Georgia"/>
+            <w:color w:val="1A1A1A"/>
+            <w:sz w:val="22"/>
+          </w:rPr>
+          <w:t>road noise</w:t>
+        </w:r>
+      </w:ins>
+      <w:r>
+        <w:rPr>
+          <w:rFonts w:ascii="Georgia" w:hAnsi="Georgia"/>
+          <w:color w:val="1A1A1A"/>
+          <w:sz w:val="22"/>
+        </w:rPr>
+        <w:t xml:space="preserve"> dies away, in which the forest seems to draw a long breath and look down at you. The light shifts. The temperature drops a degree or two. You become, very suddenly, a small thing among older things — and that smallness is the beginning of attention.</w:t>
+      </w:r>
+      <w:commentRangeEnd w:id="3"/>
+      <w:r>
+        <w:rPr>
+          <w:rStyle w:val="CommentReference"/>
+        </w:rPr>
+        <w:commentReference w:id="3"/>
       </w:r>
     </w:p>
     <w:p>
@@ -586,13 +622,49 @@
           <w:sz w:val="22"/>
         </w:rPr>
       </w:pPr>
+      <w:commentRangeStart w:id="0"/>
       <w:r>
         <w:rPr>
           <w:rFonts w:ascii="Georgia" w:hAnsi="Georgia" w:hint="eastAsia"/>
           <w:color w:val="1A1A1A"/>
           <w:sz w:val="22"/>
         </w:rPr>
-        <w:t>The first lesson of an old forest is patience. Nothing here is in a hurry. A Douglas fir grown to two hundred feet has spent five human lifetimes reaching for the sun; the moss on its northern flank has been quietly composing itself for a century. To walk through such a place at a city pace is to miss everything that matters.</w:t>
+        <w:t xml:space="preserve">The first lesson of an old forest is patience. Nothing here is in a hurry. A Douglas fir grown to two hundred feet has spent five human lifetimes reaching for the sun; the moss on its northern flank has been quietly composing itself for a century. To walk through such a place at a </w:t>
+      </w:r>
+      <w:del w:id="100" w:author="Leo Martin" w:date="2026-08-22T09:30:00Z">
+        <w:r>
+          <w:rPr>
+            <w:rFonts w:ascii="Georgia" w:hAnsi="Georgia" w:hint="eastAsia"/>
+            <w:color w:val="1A1A1A"/>
+            <w:sz w:val="22"/>
+          </w:rPr>
+          <w:delText>city pace</w:delText>
+        </w:r>
+      </w:del>
+      <w:ins w:id="101" w:author="Leo Martin" w:date="2026-08-22T09:30:00Z">
+        <w:r>
+          <w:rPr>
+            <w:rFonts w:ascii="Georgia" w:hAnsi="Georgia" w:hint="eastAsia"/>
+            <w:color w:val="1A1A1A"/>
+            <w:sz w:val="22"/>
+          </w:rPr>
+          <w:t>hurried pace</w:t>
+        </w:r>
+      </w:ins>
+      <w:r>
+        <w:rPr>
+          <w:rFonts w:ascii="Georgia" w:hAnsi="Georgia" w:hint="eastAsia"/>
+          <w:color w:val="1A1A1A"/>
+          <w:sz w:val="22"/>
+        </w:rPr>
+        <w:t xml:space="preserve"> is to miss everything that matters.</w:t>
+      </w:r>
+      <w:commentRangeEnd w:id="0"/>
+      <w:r>
+        <w:rPr>
+          <w:rStyle w:val="CommentReference"/>
+        </w:rPr>
+        <w:commentReference w:id="0"/>
       </w:r>
     </w:p>
     <w:p>
@@ -605,6 +677,7 @@
           <w:sz w:val="22"/>
         </w:rPr>
       </w:pPr>
+      <w:commentRangeStart w:id="2"/>
       <w:r>
         <w:rPr>
           <w:rFonts w:ascii="Georgia" w:hAnsi="Georgia" w:hint="eastAsia"/>
@@ -644,6 +717,13 @@
           <w:sz w:val="22"/>
         </w:rPr>
         <w:t xml:space="preserve"> knits the trees into a single, conversational organism. Sugar flows from the strong to the struggling. Warning signals travel root to root. The forest you see is the smaller half of the forest that is.</w:t>
+      </w:r>
+      <w:commentRangeEnd w:id="2"/>
+      <w:r>
+        <w:rPr>
+          <w:rStyle w:val="CommentReference"/>
+        </w:rPr>
+        <w:commentReference w:id="2"/>
       </w:r>
     </w:p>
     <w:p>
@@ -2437,6 +2517,84 @@
 </w:document>
 </file>
 
+<file path=word/comments.xml><?xml version="1.0" encoding="utf-8"?>
+<w:comments xmlns:w="http://schemas.openxmlformats.org/wordprocessingml/2006/main" xmlns:w14="http://schemas.microsoft.com/office/word/2010/wordml">
+  <w:comment w:id="0" w:author="Maya Chen" w:date="2026-08-20T09:00:00Z">
+    <w:p>
+      <w:pPr>
+        <w:pStyle w:val="CommentText"/>
+      </w:pPr>
+      <w:r>
+        <w:rPr>
+          <w:rStyle w:val="CommentReference"/>
+        </w:rPr>
+        <w:annotationRef/>
+      </w:r>
+      <w:r>
+        <w:t>Could we connect this idea of patience more directly to the reader's own pace?</w:t>
+      </w:r>
+    </w:p>
+  </w:comment>
+  <w:comment w:id="1" w:author="Leo Martin" w:date="2026-08-21T09:00:00Z">
+    <w:p>
+      <w:pPr>
+        <w:pStyle w:val="CommentText"/>
+      </w:pPr>
+      <w:r>
+        <w:rPr>
+          <w:rStyle w:val="CommentReference"/>
+        </w:rPr>
+        <w:annotationRef/>
+      </w:r>
+      <w:r>
+        <w:t>Yes. The final sentence now makes that contrast explicit without changing the tone.</w:t>
+      </w:r>
+    </w:p>
+  </w:comment>
+  <w:comment w:id="2" w:author="Priya Shah" w:date="2026-08-22T09:00:00Z">
+    <w:p>
+      <w:pPr>
+        <w:pStyle w:val="CommentText"/>
+      </w:pPr>
+      <w:r>
+        <w:rPr>
+          <w:rStyle w:val="CommentReference"/>
+        </w:rPr>
+        <w:annotationRef/>
+      </w:r>
+      <w:r>
+        <w:t>Fact-check complete. The description is appropriately framed for this editorial sample.</w:t>
+      </w:r>
+    </w:p>
+  </w:comment>
+  <w:comment w:id="3" w:author="Noah Williams" w:date="2026-08-23T09:00:00Z">
+    <w:p>
+      <w:pPr>
+        <w:pStyle w:val="CommentText"/>
+      </w:pPr>
+      <w:r>
+        <w:rPr>
+          <w:rStyle w:val="CommentReference"/>
+        </w:rPr>
+        <w:annotationRef/>
+      </w:r>
+      <w:r>
+        <w:t>Proofing note: normalize the compound word here for a smoother read.</w:t>
+      </w:r>
+    </w:p>
+  </w:comment>
+</w:comments>
+</file>
+
+<file path=word/commentsExtended.xml><?xml version="1.0" encoding="utf-8"?>
+<w15:commentsEx xmlns:w15="http://schemas.microsoft.com/office/word/2012/wordml">
+  <w15:commentEx w15:paraId="A8100000"/>
+  <w15:commentEx w15:paraId="A8100001" w15:paraIdParent="A8100000"/>
+  <w15:commentEx w15:paraId="A8100002" w15:done="1"/>
+  <w15:commentEx w15:paraId="A8100003"/>
+</w15:commentsEx>
+</file>
+
 <file path=word/endnotes.xml><?xml version="1.0" encoding="utf-8"?>
 <w:endnotes xmlns:wpc="http://schemas.microsoft.com/office/word/2010/wordprocessingCanvas" xmlns:cx="http://schemas.microsoft.com/office/drawing/2014/chartex" xmlns:cx1="http://schemas.microsoft.com/office/drawing/2015/9/8/chartex" xmlns:cx2="http://schemas.microsoft.com/office/drawing/2015/10/21/chartex" xmlns:cx3="http://schemas.microsoft.com/office/drawing/2016/5/9/chartex" xmlns:cx4="http://schemas.microsoft.com/office/drawing/2016/5/10/chartex" xmlns:cx5="http://schemas.microsoft.com/office/drawing/2016/5/11/chartex" xmlns:cx6="http://schemas.microsoft.com/office/drawing/2016/5/12/chartex" xmlns:cx7="http://schemas.microsoft.com/office/drawing/2016/5/13/chartex" xmlns:cx8="http://schemas.microsoft.com/office/drawing/2016/5/14/chartex" xmlns:mc="http://schemas.openxmlformats.org/markup-compatibility/2006" xmlns:aink="http://schemas.microsoft.com/office/drawing/2016/ink" xmlns:am3d="http://schemas.microsoft.com/office/drawing/2017/model3d" xmlns:o="urn:schemas-microsoft-com:office:office" xmlns:oel="http://schemas.microsoft.com/office/2019/extlst" xmlns:r="http://schemas.openxmlformats.org/officeDocument/2006/relationships" xmlns:m="http://schemas.openxmlformats.org/officeDocument/2006/math" xmlns:v="urn:schemas-microsoft-com:vml" xmlns:wp14="http://schemas.microsoft.com/office/word/2010/wordprocessingDrawing" xmlns:wp="http://schemas.openxmlformats.org/drawingml/2006/wordprocessingDrawing" xmlns:w10="urn:schemas-microsoft-com:office:word" xmlns:w="http://schemas.openxmlformats.org/wordprocessingml/2006/main" xmlns:w14="http://schemas.microsoft.com/office/word/2010/wordml" xmlns:w15="http://schemas.microsoft.com/office/word/2012/wordml" xmlns:w16cex="http://schemas.microsoft.com/office/word/2018/wordml/cex" xmlns:w16cid="http://schemas.microsoft.com/office/word/2016/wordml/cid" xmlns:w16="http://schemas.microsoft.com/office/word/2018/wordml" xmlns:w16du="http://schemas.microsoft.com/office/word/2023/wordml/word16du" xmlns:w16sdtdh="http://schemas.microsoft.com/office/word/2020/wordml/sdtdatahash" xmlns:w16sdtfl="http://schemas.microsoft.com/office/word/2024/wordml/sdtformatlock" xmlns:w16se="http://schemas.microsoft.com/office/word/2015/wordml/symex" xmlns:wpg="http://schemas.microsoft.com/office/word/2010/wordprocessingGroup" xmlns:wpi="http://schemas.microsoft.com/office/word/2010/wordprocessingInk" xmlns:wne="http://schemas.microsoft.com/office/word/2006/wordml" xmlns:wps="http://schemas.microsoft.com/office/word/2010/wordprocessingShape" mc:Ignorable="w14 w15 w16se w16cid w16 w16cex w16sdtdh w16sdtfl w16du wp14">
   <w:endnote w:type="separator" w:id="-1">
@@ -2641,6 +2799,15 @@
     <w:abstractNumId w:val="0"/>
   </w:num>
 </w:numbering>
+</file>
+
+<file path=word/people.xml><?xml version="1.0" encoding="utf-8"?>
+<w15:people xmlns:w15="http://schemas.microsoft.com/office/word/2012/wordml">
+  <w15:person w15:author="Maya Chen"/>
+  <w15:person w15:author="Leo Martin"/>
+  <w15:person w15:author="Priya Shah"/>
+  <w15:person w15:author="Noah Williams"/>
+</w15:people>
 </file>
 
 <file path=word/styles.xml><?xml version="1.0" encoding="utf-8"?>
@@ -4036,28 +4203,6 @@
 </a:theme>
 </file>
 
-<file path=word/webextensions/taskpanes.xml><?xml version="1.0" encoding="utf-8"?>
-<wetp:taskpanes xmlns:wetp="http://schemas.microsoft.com/office/webextensions/taskpanes/2010/11">
-  <wetp:taskpane dockstate="right" visibility="0" width="350" row="0">
-    <wetp:webextensionref xmlns:r="http://schemas.openxmlformats.org/officeDocument/2006/relationships" r:id="rId1"/>
-  </wetp:taskpane>
-</wetp:taskpanes>
-</file>
-
-<file path=word/webextensions/webextension1.xml><?xml version="1.0" encoding="utf-8"?>
-<we:webextension xmlns:we="http://schemas.microsoft.com/office/webextensions/webextension/2010/11" id="{5821F950-5356-AF46-95D8-AF47854D52CA}">
-  <we:reference id="wa200010453" version="1.0.0.1" store="ja-JP" storeType="OMEX"/>
-  <we:alternateReferences>
-    <we:reference id="WA200010453" version="1.0.0.1" store="" storeType="OMEX"/>
-  </we:alternateReferences>
-  <we:properties>
-    <we:property name="claude.fileId" value="&quot;0b890f32-71f1-4b5d-ab41-bedbc8b9b3cc&quot;"/>
-  </we:properties>
-  <we:bindings/>
-  <we:snapshot xmlns:r="http://schemas.openxmlformats.org/officeDocument/2006/relationships"/>
-</we:webextension>
-</file>
-
 <file path=customXml/item1.xml><?xml version="1.0" encoding="utf-8"?>
 <b:Sources xmlns:b="http://schemas.openxmlformats.org/officeDocument/2006/bibliography" xmlns="http://schemas.openxmlformats.org/officeDocument/2006/bibliography" SelectedStyle="/APASixthEditionOfficeOnline.xsl" StyleName="APA" Version="6"/>
 </file>

</xml_diff>

<commit_message>
feat(review): add themeable cross-format comment UI
Add a built-in read-only comment presentation for DOCX, PPTX, and XLSX while preserving primitive data and geometry APIs for application-owned interfaces. Keep card structure stable and CSS-themeable, remeasure geometry changes independently of optional connectors, and expose comment-aware selection context across formats.

Restore the public documentation boundary: format pages contain live examples, API tables live under /api, and shared ownership, rendering-mode, and optional-renderer guidance lives under /production. Add format comment demos and focused architecture, API, layout, and theme coverage.

Verification: focused comment/API/site tests (269 passed); full site tests (159 passed); Astro static build (31 pages); viewer API symmetry check; git diff --check.

Co-Authored-By: Codex GPT-5 <noreply@openai.com>
</commit_message>
<xml_diff>
--- a/packages/docx/public/demo/sample-1.docx
+++ b/packages/docx/public/demo/sample-1.docx
@@ -2519,7 +2519,7 @@
 
 <file path=word/comments.xml><?xml version="1.0" encoding="utf-8"?>
 <w:comments xmlns:w="http://schemas.openxmlformats.org/wordprocessingml/2006/main" xmlns:w14="http://schemas.microsoft.com/office/word/2010/wordml">
-  <w:comment w:id="0" w:author="Maya Chen" w:date="2026-08-20T09:00:00Z">
+  <w:comment w:id="0" w:author="Olivia Bennett" w:date="2026-08-20T09:00:00Z">
     <w:p>
       <w:pPr>
         <w:pStyle w:val="CommentText"/>
@@ -2803,7 +2803,7 @@
 
 <file path=word/people.xml><?xml version="1.0" encoding="utf-8"?>
 <w15:people xmlns:w15="http://schemas.microsoft.com/office/word/2012/wordml">
-  <w15:person w15:author="Maya Chen"/>
+  <w15:person w15:author="Olivia Bennett"/>
   <w15:person w15:author="Leo Martin"/>
   <w15:person w15:author="Priya Shah"/>
   <w15:person w15:author="Noah Williams"/>

</xml_diff>